<commit_message>
Revise report: indents, 13pt tables with captions below, no in-text citations, 35 pages
- First-line indent on body paragraphs
- Table text at 13pt, captions moved below tables, column widths balanced
- In-text citation markers removed (reference list kept)
- Each list/chapter starts on a new page; headings kept with their content
- Lecturers: TS. Lê Thanh Hương, TS. Trần Quang Đức, TS. Ngô Lam Trung
- Repetitive passages condensed so the whole report fits in 35 pages
- Handout updated for the merged subsections

Co-Authored-By: Claude Opus 5.5 <noreply@anthropic.com>
Claude-Session: https://claude.ai/code/session_01GCchbYXryKBoz5ScznJmLu
</commit_message>
<xml_diff>
--- a/Handout-Thuyet-trinh-Nhom-13.docx
+++ b/Handout-Thuyet-trinh-Nhom-13.docx
@@ -1380,7 +1380,7 @@
           <w:sz w:val="26"/>
           <w:szCs w:val="26"/>
         </w:rPr>
-        <w:t xml:space="preserve">Phần giải thích quan hệ giữa ba hướng (mục II.3).</w:t>
+        <w:t xml:space="preserve">Phần giải thích quan hệ giữa ba hướng (cuối mục II.2).</w:t>
       </w:r>
     </w:p>
     <w:p>
@@ -2077,7 +2077,7 @@
           <w:sz w:val="26"/>
           <w:szCs w:val="26"/>
         </w:rPr>
-        <w:t xml:space="preserve">Chi tiết moments accountant và k-eidetic.</w:t>
+        <w:t xml:space="preserve">Chi tiết moments accountant và các bước của tấn công trích xuất.</w:t>
       </w:r>
     </w:p>
     <w:p>

</xml_diff>